<commit_message>
RC 800 Sectional 4: replace Passage 3 and harden questions after blind solves
Passage 3 is now the colonial railways debate (Dutt and the guarantee
against Donaldson's estimates), since the Gorakhpur rumour study is an
NCERT staple. Word, figure and tone distractors now carry true reason
clauses so only the label decides; main-idea keys no longer share a
hedge pattern; fact fixes for Bigger, Balaban and the New York Edition.

Co-Authored-By: Claude Opus 5.5 <noreply@anthropic.com>
Claude-Session: https://claude.ai/code/session_01JEFnJwWLYkcsS1QcD4NEhs
</commit_message>
<xml_diff>
--- a/rc-800-sectional-4/RC_800_Sectional_4_Answer_Key.docx
+++ b/rc-800-sectional-4/RC_800_Sectional_4_Answer_Key.docx
@@ -1662,7 +1662,7 @@
                 <w:sz w:val="20"/>
                 <w:szCs w:val="20"/>
               </w:rPr>
-              <w:t xml:space="preserve">Q9, Q12, Q17, Q21</w:t>
+              <w:t xml:space="preserve">Q10, Q12</w:t>
             </w:r>
           </w:p>
         </w:tc>
@@ -2418,7 +2418,7 @@
                 <w:sz w:val="20"/>
                 <w:szCs w:val="20"/>
               </w:rPr>
-              <w:t xml:space="preserve">Q3, Q7, Q8, Q10, Q12, Q14, Q15, Q23</w:t>
+              <w:t xml:space="preserve">Q3, Q7, Q8, Q10, Q12, Q14, Q15</w:t>
             </w:r>
           </w:p>
         </w:tc>
@@ -4154,7 +4154,7 @@
                 <w:sz w:val="20"/>
                 <w:szCs w:val="20"/>
               </w:rPr>
-              <w:t xml:space="preserve">Conclusion (paragraph)</w:t>
+              <w:t xml:space="preserve">Conclusion (two paragraphs)</w:t>
             </w:r>
           </w:p>
         </w:tc>
@@ -7258,7 +7258,7 @@
                 <w:sz w:val="20"/>
                 <w:szCs w:val="20"/>
               </w:rPr>
-              <w:t xml:space="preserve">X</w:t>
+              <w:t xml:space="preserve">N</w:t>
             </w:r>
           </w:p>
         </w:tc>
@@ -7514,7 +7514,7 @@
                 <w:sz w:val="20"/>
                 <w:szCs w:val="20"/>
               </w:rPr>
-              <w:t xml:space="preserve">L</w:t>
+              <w:t xml:space="preserve">X</w:t>
             </w:r>
           </w:p>
         </w:tc>
@@ -8613,7 +8613,7 @@
                 <w:sz w:val="20"/>
                 <w:szCs w:val="20"/>
               </w:rPr>
-              <w:t xml:space="preserve">Conclusion (paragraph)</w:t>
+              <w:t xml:space="preserve">Conclusion (two paragraphs)</w:t>
             </w:r>
           </w:p>
         </w:tc>
@@ -9197,7 +9197,7 @@
                 <w:sz w:val="20"/>
                 <w:szCs w:val="20"/>
               </w:rPr>
-              <w:t xml:space="preserve">X</w:t>
+              <w:t xml:space="preserve">A</w:t>
             </w:r>
           </w:p>
         </w:tc>
@@ -10294,7 +10294,7 @@
                 <w:sz w:val="20"/>
                 <w:szCs w:val="20"/>
               </w:rPr>
-              <w:t xml:space="preserve">X</w:t>
+              <w:t xml:space="preserve">N</w:t>
             </w:r>
           </w:p>
         </w:tc>
@@ -10805,7 +10805,7 @@
                 <w:sz w:val="20"/>
                 <w:szCs w:val="20"/>
               </w:rPr>
-              <w:t xml:space="preserve">L</w:t>
+              <w:t xml:space="preserve">O</w:t>
             </w:r>
           </w:p>
         </w:tc>
@@ -12940,7 +12940,7 @@
           <w:sz w:val="22"/>
           <w:szCs w:val="22"/>
         </w:rPr>
-        <w:t xml:space="preserve">The sceptic's case against self-promising confuses one person with one standpoint, though correcting it leaves open whether what binds is still a promise.</w:t>
+        <w:t xml:space="preserve">The sceptic's case against self-promising confuses persons with standpoints, but correcting it exposes a further question about what wrong a defaulter commits.</w:t>
       </w:r>
     </w:p>
     <w:p>
@@ -13007,7 +13007,7 @@
           <w:sz w:val="22"/>
           <w:szCs w:val="22"/>
         </w:rPr>
-        <w:t xml:space="preserve">Paragraph 2 says the argument 'passes silently from the identity of persons to the identity of standpoints'; paragraphs 3 and 4 defend and price that reply; paragraph 5 ends: 'whether what it distinguishes still deserves the name of a promise is another matter.'</w:t>
+        <w:t xml:space="preserve">Paragraph 2 says the argument 'passes silently from the identity of persons to the identity of standpoints'; paragraphs 3 and 4 defend and price that reply; paragraph 5 asks 'what, if anything, the defaulter has done wrong' and ends by doubting 'whether what it distinguishes still deserves the name of a promise'.</w:t>
       </w:r>
     </w:p>
     <w:p>
@@ -13022,7 +13022,7 @@
           <w:sz w:val="21"/>
           <w:szCs w:val="21"/>
         </w:rPr>
-        <w:t xml:space="preserve">The passage moves from the sceptic's argument (para 1) to the author's diagnosis of it (para 2), defends that diagnosis (para 3), concedes its cost (para 4) and leaves open whether what survives is a promise (para 5). Only (c) holds both the reply and the remainder.</w:t>
+        <w:t xml:space="preserve">The passage moves from the sceptic's argument (para 1) to the author's diagnosis of it (para 2), defends that diagnosis (para 3), concedes its cost (para 4) and then raises the harder question of what a defaulter does wrong (para 5). Only (c) holds both the correction and what it leaves exposed.</w:t>
       </w:r>
     </w:p>
     <w:p>
@@ -13241,7 +13241,7 @@
           <w:sz w:val="22"/>
           <w:szCs w:val="22"/>
         </w:rPr>
-        <w:t xml:space="preserve">People who abandon promises to themselves generally cannot tell, even on reflection, whether they judged a promise's purpose spent or merely wished to stop.</w:t>
+        <w:t xml:space="preserve">Notes people make when abandoning a promise to themselves seldom mention its purpose, yet asked later, most say they dropped it because its purpose was spent.</w:t>
       </w:r>
     </w:p>
     <w:p>
@@ -13368,7 +13368,7 @@
           <w:sz w:val="22"/>
           <w:szCs w:val="22"/>
         </w:rPr>
-        <w:t xml:space="preserve">The claim is that a person can tell whether she is asking 'does the purpose still hold?' or 'do I still feel like it?'. If people generally cannot tell these apart even on reflection, the claim fails.</w:t>
+        <w:t xml:space="preserve">The claim is that a person can tell whether she is asking 'does the purpose still hold?' or 'do I still feel like it?'. If her notes at the time never raise the purpose, yet afterwards she sincerely reports that the purpose was spent, she has mistaken which question she was asking.</w:t>
       </w:r>
     </w:p>
     <w:p>
@@ -13383,7 +13383,7 @@
           <w:sz w:val="21"/>
           <w:szCs w:val="21"/>
         </w:rPr>
-        <w:t xml:space="preserve">The question targets one narrow sub-claim at the end of paragraph 3, not the whole reply. Only (a) denies the self-knowledge the sub-claim asserts, and does so generally rather than occasionally.</w:t>
+        <w:t xml:space="preserve">The question targets one narrow sub-claim at the end of paragraph 3, not the whole reply. Only (a) is evidence that people misidentify which of the two questions they were asking; the others concern outside checking, a comparison the passage never makes, and habit.</w:t>
       </w:r>
     </w:p>
     <w:p>
@@ -13993,7 +13993,7 @@
           <w:sz w:val="22"/>
           <w:szCs w:val="22"/>
         </w:rPr>
-        <w:t xml:space="preserve">a party owed the performance, because promising implies someone to whom keeping the promise is due.</w:t>
+        <w:t xml:space="preserve">a party owed the performance, because no second person exists to whom a self-promise could be kept.</w:t>
       </w:r>
     </w:p>
     <w:p>
@@ -14023,7 +14023,7 @@
           <w:sz w:val="22"/>
           <w:szCs w:val="22"/>
         </w:rPr>
-        <w:t xml:space="preserve">one who gives credence, because a promise to oneself is, for the sceptic, only 'a statement of present intention'.</w:t>
+        <w:t xml:space="preserve">one who gives credence, because the sceptic calls a self-promise only 'a statement of present intention'.</w:t>
       </w:r>
     </w:p>
     <w:p>
@@ -14775,7 +14775,7 @@
           <w:sz w:val="22"/>
           <w:szCs w:val="22"/>
         </w:rPr>
-        <w:t xml:space="preserve">Those who most often break their promises to themselves are also those least able to set a promise's purpose above how they happen to feel at the time.</w:t>
+        <w:t xml:space="preserve">Those who most often break their promises to themselves are least able to put a promise's purpose above their feelings, though they make no more such promises.</w:t>
       </w:r>
     </w:p>
     <w:p>
@@ -15157,7 +15157,7 @@
           <w:sz w:val="22"/>
           <w:szCs w:val="22"/>
         </w:rPr>
-        <w:t xml:space="preserve">To argue that laboratory studies of bacteria grown in rich medium can rarely reveal how infections actually behave inside the bodies of patients.</w:t>
+        <w:t xml:space="preserve">To argue that laboratory studies of bacteria grown in rich medium may reveal little about infections, leaving the clinical value of persister research open.</w:t>
       </w:r>
     </w:p>
     <w:p>
@@ -15320,7 +15320,7 @@
           <w:sz w:val="21"/>
           <w:szCs w:val="21"/>
         </w:rPr>
-        <w:t xml:space="preserve">The caveat about rich medium is one qualification in paragraph 5, made about these observations, not a general thesis about laboratory studies.</w:t>
+        <w:t xml:space="preserve">The caveat about rich medium is one qualification in paragraph 5, made about these observations. The passage is not mainly about laboratory studies in general, and it never questions the value of persister research.</w:t>
       </w:r>
     </w:p>
     <w:p>
@@ -15488,7 +15488,7 @@
           <w:sz w:val="22"/>
           <w:szCs w:val="22"/>
         </w:rPr>
-        <w:t xml:space="preserve">A culture's average ATP level falls measurably in the minutes before its killing curve flattens out into the plateau that is the mark of persistence.</w:t>
+        <w:t xml:space="preserve">A culture's average ATP level falls in the minutes before its killing curve flattens, while its toxin–antitoxin activity stays the same throughout.</w:t>
       </w:r>
     </w:p>
     <w:p>
@@ -15650,7 +15650,7 @@
           <w:sz w:val="21"/>
           <w:szCs w:val="21"/>
         </w:rPr>
-        <w:t xml:space="preserve">A change in the average is what paragraph 3 calls 'close to useless': it 'could reflect a small change in every cell or a large change in a handful'.</w:t>
+        <w:t xml:space="preserve">This mentions both accounts but rests on culture averages, which paragraph 3 calls 'close to useless': a shift 'could reflect a small change in every cell or a large change in a handful'.</w:t>
       </w:r>
     </w:p>
     <w:p>
@@ -15789,7 +15789,7 @@
           <w:sz w:val="22"/>
           <w:szCs w:val="22"/>
         </w:rPr>
-        <w:t xml:space="preserve">A protective trait that was genetic would have passed to the survivors' descendants, so that the regrown culture would have resisted the drug better.</w:t>
+        <w:t xml:space="preserve">Had the survivors' protection been genetic, their descendants would have inherited it and resisted the drug better.</w:t>
       </w:r>
     </w:p>
     <w:p>
@@ -15819,7 +15819,7 @@
           <w:sz w:val="22"/>
           <w:szCs w:val="22"/>
         </w:rPr>
-        <w:t xml:space="preserve">The surviving cells had already been dormant when the penicillin arrived, and so offered the drug no active process that it could corrupt.</w:t>
+        <w:t xml:space="preserve">The surviving cells had already been dormant when the penicillin arrived, and so offered the drug nothing that it could corrupt.</w:t>
       </w:r>
     </w:p>
     <w:p>
@@ -15849,7 +15849,7 @@
           <w:sz w:val="22"/>
           <w:szCs w:val="22"/>
         </w:rPr>
-        <w:t xml:space="preserve">Penicillin kills a bacterium only while the cell is building its wall, so that the cells which are dividing are the most exposed to it.</w:t>
+        <w:t xml:space="preserve">Penicillin kills a bacterium only while the cell is building its wall, so the dividing cells are the ones most exposed to the drug.</w:t>
       </w:r>
     </w:p>
     <w:p>
@@ -15879,7 +15879,7 @@
           <w:sz w:val="22"/>
           <w:szCs w:val="22"/>
         </w:rPr>
-        <w:t xml:space="preserve">The original culture contained no cell at all that was already resistant to penicillin before the drug was first added to it in the flask.</w:t>
+        <w:t xml:space="preserve">Bigger had screened the original culture for resistant cells, and found none, before he first added any penicillin to it.</w:t>
       </w:r>
     </w:p>
     <w:p>
@@ -15931,7 +15931,7 @@
           <w:sz w:val="21"/>
           <w:szCs w:val="21"/>
         </w:rPr>
-        <w:t xml:space="preserve">Negate (a): if a genetic protection need not show up in the descendants, then descendants dying 'as the original had' no longer rules out resistance. So the conclusion depends on (a).</w:t>
+        <w:t xml:space="preserve">Negate (a): if a genetic protection need not show up in the descendants, then descendants dying 'as the original had' no longer rules out resistance. So the conclusion depends on (a), and needs nothing about how the culture was prepared.</w:t>
       </w:r>
     </w:p>
     <w:p>
@@ -16033,7 +16033,7 @@
           <w:sz w:val="20"/>
           <w:szCs w:val="20"/>
         </w:rPr>
-        <w:t xml:space="preserve">(d) · X (Absolute word): </w:t>
+        <w:t xml:space="preserve">(d) · N (Supported, not the needed link): </w:t>
       </w:r>
       <w:r>
         <w:rPr>
@@ -16042,7 +16042,7 @@
           <w:sz w:val="21"/>
           <w:szCs w:val="21"/>
         </w:rPr>
-        <w:t xml:space="preserve">This is not needed. Had resistant cells been present, the regrowth test would have exposed them. The conclusion is about the survivors he regrew, and they were not resistant.</w:t>
+        <w:t xml:space="preserve">The conclusion rests on the regrowth test, not on any earlier screening. The passage mentions none, and the conclusion would stand without it, because resistant survivors would have shown up when he regrew them.</w:t>
       </w:r>
     </w:p>
     <w:p>
@@ -16240,7 +16240,7 @@
           <w:sz w:val="22"/>
           <w:szCs w:val="22"/>
         </w:rPr>
-        <w:t xml:space="preserve">The retracted papers concerned how persisters are counted rather than why they survive, so they had no bearing on any account of survival.</w:t>
+        <w:t xml:space="preserve">Every later study of persistence has confirmed that the survivors are dormant, so losing one line of evidence could not weaken that case.</w:t>
       </w:r>
     </w:p>
     <w:p>
@@ -16394,7 +16394,7 @@
           <w:sz w:val="20"/>
           <w:szCs w:val="20"/>
         </w:rPr>
-        <w:t xml:space="preserve">(d) · L (Mixes up two things): </w:t>
+        <w:t xml:space="preserve">(d) · X (Absolute word): </w:t>
       </w:r>
       <w:r>
         <w:rPr>
@@ -16403,7 +16403,7 @@
           <w:sz w:val="21"/>
           <w:szCs w:val="21"/>
         </w:rPr>
-        <w:t xml:space="preserve">The retracted work was about whether deleting the modules 'reduced persistence', which is evidence about why cells survive. That is why its loss 'removed the strongest evidence for a dedicated switch'.</w:t>
+        <w:t xml:space="preserve">Paragraph 4 reports a later study whose survivors 'had been growing and dividing much like their neighbours'. Not every study confirms dormancy.</w:t>
       </w:r>
     </w:p>
     <w:p>
@@ -17351,7 +17351,7 @@
           <w:sz w:val="22"/>
           <w:szCs w:val="22"/>
         </w:rPr>
-        <w:t xml:space="preserve">Quantitative history can settle a controversy only when its practitioners and their critics first agree on what the past is to be compared with.</w:t>
+        <w:t xml:space="preserve">Quantitative history can settle a controversy only when its practitioners and their critics have first agreed on what the past is to be compared with.</w:t>
       </w:r>
     </w:p>
     <w:p>
@@ -17381,7 +17381,7 @@
           <w:sz w:val="22"/>
           <w:szCs w:val="22"/>
         </w:rPr>
-        <w:t xml:space="preserve">The econometrics show the railways raised incomes, but by comparing them with no railway they leave open questions of alternatives, shares and terms.</w:t>
+        <w:t xml:space="preserve">Estimates showing that the railways raised incomes answer a different question from the nationalists', and so settle less of the old debate than is commonly supposed.</w:t>
       </w:r>
     </w:p>
     <w:p>
@@ -17433,7 +17433,7 @@
           <w:sz w:val="21"/>
           <w:szCs w:val="21"/>
         </w:rPr>
-        <w:t xml:space="preserve">The passage accepts the econometric finding of real gains and the rejection of 'outright' impoverishment, then shows that the comparison behind it leaves three of the critics' questions untouched. (d) has both halves.</w:t>
+        <w:t xml:space="preserve">The passage accepts the econometric gains, then argues that they are measured against a different alternative from the critics' and so settle only part of the dispute: outright impoverishment, not alternatives, distribution or the guarantee. (d) has both halves.</w:t>
       </w:r>
     </w:p>
     <w:p>
@@ -17742,7 +17742,7 @@
           <w:sz w:val="22"/>
           <w:szCs w:val="22"/>
         </w:rPr>
-        <w:t xml:space="preserve">In connected districts, the incomes of grain merchants rose far faster than the real wages of the labourers who worked the land.</w:t>
+        <w:t xml:space="preserve">In connected districts, grain merchants' incomes rose quickly while the real wages of the labourers who worked the land barely moved.</w:t>
       </w:r>
     </w:p>
     <w:p>
@@ -17954,7 +17954,7 @@
           <w:sz w:val="17"/>
           <w:szCs w:val="17"/>
         </w:rPr>
-        <w:t xml:space="preserve">Q15 · CONCLUSION (PARAGRAPH)</w:t>
+        <w:t xml:space="preserve">Q15 · CONCLUSION (TWO PARAGRAPHS)</w:t>
       </w:r>
     </w:p>
     <w:p>
@@ -17983,7 +17983,7 @@
           <w:sz w:val="22"/>
           <w:szCs w:val="22"/>
         </w:rPr>
-        <w:t xml:space="preserve">Which of the following can be most reasonably concluded from the fourth paragraph?</w:t>
+        <w:t xml:space="preserve">Which of the following conclusions is best supported by the third and fourth paragraphs taken together?</w:t>
       </w:r>
     </w:p>
     <w:p>
@@ -18013,7 +18013,7 @@
           <w:sz w:val="22"/>
           <w:szCs w:val="22"/>
         </w:rPr>
-        <w:t xml:space="preserve">On balance the railways made famine more likely in the districts they connected, since grain could flow out of them whenever prices elsewhere rose.</w:t>
+        <w:t xml:space="preserve">Unlike the income finding, the famine finding measures the railways against an India in which no district had yet been connected at all.</w:t>
       </w:r>
     </w:p>
     <w:p>
@@ -18043,7 +18043,7 @@
           <w:sz w:val="22"/>
           <w:szCs w:val="22"/>
         </w:rPr>
-        <w:t xml:space="preserve">Officials in the famine of 1876 to 1878 deliberately used the railways to move grain away from the very districts that most needed it.</w:t>
+        <w:t xml:space="preserve">The famine finding is more trustworthy than the income finding, since it rests on records of rainfall rather than on estimates of output.</w:t>
       </w:r>
     </w:p>
     <w:p>
@@ -18073,7 +18073,7 @@
           <w:sz w:val="22"/>
           <w:szCs w:val="22"/>
         </w:rPr>
-        <w:t xml:space="preserve">An average weakening of the rainfall–famine link is compatible with some connected districts having fared worse in particular famines.</w:t>
+        <w:t xml:space="preserve">Both findings are averages, and neither rules out particular people or districts having lost out even as the average improved.</w:t>
       </w:r>
     </w:p>
     <w:p>
@@ -18103,7 +18103,7 @@
           <w:sz w:val="22"/>
           <w:szCs w:val="22"/>
         </w:rPr>
-        <w:t xml:space="preserve">The critics were right that the railways left the countryside more exposed to famine, although they somewhat overstated how large the effect was.</w:t>
+        <w:t xml:space="preserve">Both findings show that the nationalist critics were wrong about the railways, though each of them shows it for a different reason.</w:t>
       </w:r>
     </w:p>
     <w:p>
@@ -18140,7 +18140,7 @@
           <w:sz w:val="22"/>
           <w:szCs w:val="22"/>
         </w:rPr>
-        <w:t xml:space="preserve">The paragraph says the finding 'measures how far the link between rainfall and famine weakened on average, not whether particular districts in particular years were stripped of food'. Both can be true at once.</w:t>
+        <w:t xml:space="preserve">Paragraph 3: an average gain does not 'settle who received it', since the labourer may gain 'little'. Paragraph 4: the famine finding 'measures how far the link… weakened on average, not whether particular districts in particular years were stripped of food'. The same limit applies to both.</w:t>
       </w:r>
     </w:p>
     <w:p>
@@ -18155,7 +18155,7 @@
           <w:sz w:val="21"/>
           <w:szCs w:val="21"/>
         </w:rPr>
-        <w:t xml:space="preserve">The paragraph's conclusion is about what an average can and cannot show: it is compatible with local harm in particular years.</w:t>
+        <w:t xml:space="preserve">Paragraphs 3 and 4 make the same move twice: an average gain, whether in income or in protection from famine, can coexist with losses for particular people or places.</w:t>
       </w:r>
     </w:p>
     <w:p>
@@ -18204,7 +18204,7 @@
           <w:sz w:val="21"/>
           <w:szCs w:val="21"/>
         </w:rPr>
-        <w:t xml:space="preserve">This reverses the finding the paragraph accepts: integration 'protected a district against a local failure of the rains'. Outflow is a qualification, not the net effect.</w:t>
+        <w:t xml:space="preserve">Both findings compare connected districts with unconnected ones, and the passage draws no such contrast between them. What the two paragraphs share is a point about averages, not about the comparison.</w:t>
       </w:r>
     </w:p>
     <w:p>
@@ -18235,7 +18235,7 @@
           <w:sz w:val="21"/>
           <w:szCs w:val="21"/>
         </w:rPr>
-        <w:t xml:space="preserve">The paragraph reports what 'critics at the time… alleged', that grain flowed out with prices, and says nothing about officials acting deliberately.</w:t>
+        <w:t xml:space="preserve">The author never ranks the two findings or questions the data behind either.</w:t>
       </w:r>
     </w:p>
     <w:p>
@@ -18266,7 +18266,7 @@
           <w:sz w:val="21"/>
           <w:szCs w:val="21"/>
         </w:rPr>
-        <w:t xml:space="preserve">The author calls the famine result 'uncomfortable for the older critique', so the critics were not right in the main, and nothing measures how much they overstated it.</w:t>
+        <w:t xml:space="preserve">This is the reading paragraph 3 calls 'tempting' and then resists; paragraph 4 adds that 'the agreement is narrower than it looks'.</w:t>
       </w:r>
     </w:p>
     <w:p>
@@ -18297,7 +18297,7 @@
           <w:sz w:val="19"/>
           <w:szCs w:val="19"/>
         </w:rPr>
-        <w:t xml:space="preserve">Countdown 9 Q76 (a view the author reports taken as the author's own) and AILET 2 Q38</w:t>
+        <w:t xml:space="preserve">Sectional 1 Q4 and Countdown 9 Q76 (a conclusion that needs two paragraphs, against one that repeats a view the author reports)</w:t>
       </w:r>
     </w:p>
     <w:p>
@@ -18393,7 +18393,7 @@
           <w:sz w:val="22"/>
           <w:szCs w:val="22"/>
         </w:rPr>
-        <w:t xml:space="preserve">Metaphor, because the two bodies of work are identified outright with trains, with no word of comparison, to show that they never meet.</w:t>
+        <w:t xml:space="preserve">Metaphor, because the verdict and the indictment are spoken of as trains, an image the author carries on through 'timetable' and 'station'.</w:t>
       </w:r>
     </w:p>
     <w:p>
@@ -18423,7 +18423,7 @@
           <w:sz w:val="22"/>
           <w:szCs w:val="22"/>
         </w:rPr>
-        <w:t xml:space="preserve">Personification, because the verdict and the indictment are given the human power to keep appointments and to choose a destination.</w:t>
+        <w:t xml:space="preserve">Personification, because two bodies of scholarship are made to travel, keep time and fail to arrive, as though they had purposes of their own.</w:t>
       </w:r>
     </w:p>
     <w:p>
@@ -18453,7 +18453,7 @@
           <w:sz w:val="22"/>
           <w:szCs w:val="22"/>
         </w:rPr>
-        <w:t xml:space="preserve">Simile, because the two bodies of work are likened, through 'like', to trains that run side by side without ever meeting.</w:t>
+        <w:t xml:space="preserve">Simile, because the comparison of the two bodies of work with trains is made explicit with 'like' and then drawn out through 'timetable' and 'station'.</w:t>
       </w:r>
     </w:p>
     <w:p>
@@ -18483,7 +18483,7 @@
           <w:sz w:val="22"/>
           <w:szCs w:val="22"/>
         </w:rPr>
-        <w:t xml:space="preserve">Analogy, because the author reasons step by step from the scheduling of railways to the methods that economic historians use.</w:t>
+        <w:t xml:space="preserve">Analogy, because the author argues from how railway timetables are drawn up to how historians ought to choose the comparisons they make.</w:t>
       </w:r>
     </w:p>
     <w:p>
@@ -18520,7 +18520,7 @@
           <w:sz w:val="22"/>
           <w:szCs w:val="22"/>
         </w:rPr>
-        <w:t xml:space="preserve">The comparison is made explicit with 'like', and the rest of the sentence draws out the image. An explicit comparison with 'like' or 'as' is a simile, however far it is extended.</w:t>
+        <w:t xml:space="preserve">The comparison is announced with 'like', and the rest of the sentence extends the image. An explicit comparison with 'like' or 'as' is a simile, however far it is extended.</w:t>
       </w:r>
     </w:p>
     <w:p>
@@ -18535,7 +18535,7 @@
           <w:sz w:val="21"/>
           <w:szCs w:val="21"/>
         </w:rPr>
-        <w:t xml:space="preserve">'Like trains on parallel tracks' is an explicit comparison, so the figure is a simile, extended through 'timetable' and 'station'. In Sectional 3 the key was a metaphor; here 'like' does the work, and the trap is to call an extended simile a metaphor or an analogy.</w:t>
+        <w:t xml:space="preserve">'Like trains on parallel tracks' is an explicit comparison, so the figure is a simile, extended through 'timetable' and 'station'. The metaphor option describes the image accurately; only its label is wrong. In Sectional 3 the key was a metaphor; here 'like' does the work.</w:t>
       </w:r>
     </w:p>
     <w:p>
@@ -18584,7 +18584,7 @@
           <w:sz w:val="21"/>
           <w:szCs w:val="21"/>
         </w:rPr>
-        <w:t xml:space="preserve">The line does use a word of comparison: 'like trains'. A metaphor would say the verdict and the indictment are trains.</w:t>
+        <w:t xml:space="preserve">The clause describes the image correctly, but the comparison is explicit ('like trains'), so the figure is a simile. A metaphor would say the verdict and the indictment are trains.</w:t>
       </w:r>
     </w:p>
     <w:p>
@@ -18615,7 +18615,7 @@
           <w:sz w:val="21"/>
           <w:szCs w:val="21"/>
         </w:rPr>
-        <w:t xml:space="preserve">Keeping a timetable and arriving at a station are what trains do. The arguments are given a train's properties, not a person's.</w:t>
+        <w:t xml:space="preserve">Travelling, keeping a timetable and arriving at a station are what trains do, not what persons do. The arguments are given a train's properties, not human ones.</w:t>
       </w:r>
     </w:p>
     <w:p>
@@ -18646,7 +18646,7 @@
           <w:sz w:val="21"/>
           <w:szCs w:val="21"/>
         </w:rPr>
-        <w:t xml:space="preserve">No reasoning is drawn from how railways are scheduled. The line is one image, not an argument from a parallel case.</w:t>
+        <w:t xml:space="preserve">Nothing is said about how timetables are drawn up, and no argument runs from railways to historical method. The line is one image, not reasoning from a parallel case.</w:t>
       </w:r>
     </w:p>
     <w:p>
@@ -18754,7 +18754,7 @@
           <w:sz w:val="22"/>
           <w:szCs w:val="22"/>
         </w:rPr>
-        <w:t xml:space="preserve">show that the nationalist case rested on claims that later research has since discredited on every point that the critics raised.</w:t>
+        <w:t xml:space="preserve">show how much of the nationalist case depended on claims the critics had no means of testing with the data of their day.</w:t>
       </w:r>
     </w:p>
     <w:p>
@@ -18784,7 +18784,7 @@
           <w:sz w:val="22"/>
           <w:szCs w:val="22"/>
         </w:rPr>
-        <w:t xml:space="preserve">prepare for the later argument that the econometrics refute the claim of outright loss but leave the other charges open.</w:t>
+        <w:t xml:space="preserve">prepare for the later argument that the econometrics refute the claim of outright loss and leave the other charges open.</w:t>
       </w:r>
     </w:p>
     <w:p>
@@ -18936,7 +18936,7 @@
           <w:sz w:val="20"/>
           <w:szCs w:val="20"/>
         </w:rPr>
-        <w:t xml:space="preserve">(a) · X (Absolute word): </w:t>
+        <w:t xml:space="preserve">(a) · A (Added idea): </w:t>
       </w:r>
       <w:r>
         <w:rPr>
@@ -18945,7 +18945,7 @@
           <w:sz w:val="21"/>
           <w:szCs w:val="21"/>
         </w:rPr>
-        <w:t xml:space="preserve">Only the claim of outright impoverishment is discredited. The questions about alternatives, shares and terms are left open.</w:t>
+        <w:t xml:space="preserve">Paragraph 2 notes the question was reopened 'with tools the nationalists did not possess', but the detail of paragraph 1 is not there to show what the critics could test. It sets up the later sorting of their charges.</w:t>
       </w:r>
     </w:p>
     <w:p>
@@ -19115,7 +19115,7 @@
           <w:sz w:val="22"/>
           <w:szCs w:val="22"/>
         </w:rPr>
-        <w:t xml:space="preserve">a cost imposed, because the critics held that India paid for lines whose benefits went largely to others.</w:t>
+        <w:t xml:space="preserve">a cost imposed, because the critics held that India paid for lines whose gains went largely to others.</w:t>
       </w:r>
     </w:p>
     <w:p>
@@ -19145,7 +19145,7 @@
           <w:sz w:val="22"/>
           <w:szCs w:val="22"/>
         </w:rPr>
-        <w:t xml:space="preserve">an accusation, because the nationalists pressed their indictment of the railways more persistently than any other.</w:t>
+        <w:t xml:space="preserve">an accusation, because the paragraph opens with the 'charge against the railways' that the nationalists pressed.</w:t>
       </w:r>
     </w:p>
     <w:p>
@@ -19175,7 +19175,7 @@
           <w:sz w:val="22"/>
           <w:szCs w:val="22"/>
         </w:rPr>
-        <w:t xml:space="preserve">a duty entrusted, because Indians were made responsible for running the lines that the British companies had built.</w:t>
+        <w:t xml:space="preserve">a judge's instruction to a jury, because the paragraph presents the nationalists' case as an indictment.</w:t>
       </w:r>
     </w:p>
     <w:p>
@@ -19205,7 +19205,7 @@
           <w:sz w:val="22"/>
           <w:szCs w:val="22"/>
         </w:rPr>
-        <w:t xml:space="preserve">a forward rush, because the companies laid the lines in a hurry so as to reach the ports ahead of their rivals.</w:t>
+        <w:t xml:space="preserve">a headlong attack, because the critics went after the railways more persistently than after anything else.</w:t>
       </w:r>
     </w:p>
     <w:p>
@@ -19257,7 +19257,7 @@
           <w:sz w:val="21"/>
           <w:szCs w:val="21"/>
         </w:rPr>
-        <w:t xml:space="preserve">The same paragraph uses 'charge' twice in two senses. At the end, 'levied on it' and the contrast with 'investment' force the financial sense.</w:t>
+        <w:t xml:space="preserve">The paragraph uses 'charge' twice in two senses. Every reason clause here is true to the passage; only 'levied' and the contrast with 'investment' decide the sense at the end.</w:t>
       </w:r>
     </w:p>
     <w:p>
@@ -19306,7 +19306,7 @@
           <w:sz w:val="21"/>
           <w:szCs w:val="21"/>
         </w:rPr>
-        <w:t xml:space="preserve">That is the sense of 'charge' in the paragraph's first sentence ('the charge against the railways'). At the end of the paragraph the word is 'levied', which an accusation is not.</w:t>
+        <w:t xml:space="preserve">The clause is true: that is the sense of 'charge' in the paragraph's first sentence. But at the end the word is 'levied' and set against 'investment', which an accusation is not.</w:t>
       </w:r>
     </w:p>
     <w:p>
@@ -19337,7 +19337,7 @@
           <w:sz w:val="21"/>
           <w:szCs w:val="21"/>
         </w:rPr>
-        <w:t xml:space="preserve">This is the sense of 'in charge of'. Nothing says Indians ran the lines.</w:t>
+        <w:t xml:space="preserve">The paragraph does use the language of indictment, but nothing is being instructed. 'Levied on it' names a burden imposed on India.</w:t>
       </w:r>
     </w:p>
     <w:p>
@@ -19368,7 +19368,7 @@
           <w:sz w:val="21"/>
           <w:szCs w:val="21"/>
         </w:rPr>
-        <w:t xml:space="preserve">This is the sense of a cavalry charge. The passage says nothing about haste or rivalry.</w:t>
+        <w:t xml:space="preserve">The clause echoes 'pressed more persistently', but a charge in the sense of an attack is not 'levied on' anyone.</w:t>
       </w:r>
     </w:p>
     <w:p>
@@ -19497,7 +19497,7 @@
           <w:sz w:val="22"/>
           <w:szCs w:val="22"/>
         </w:rPr>
-        <w:t xml:space="preserve">James rewrote rather than completed his early novels for the collected edition, so editors ought to print the texts in which they first appeared.</w:t>
+        <w:t xml:space="preserve">James's late revisions read his early novels rather than completing them, and whether editors should print the first texts may never be settled.</w:t>
       </w:r>
     </w:p>
     <w:p>
@@ -19688,7 +19688,7 @@
           <w:sz w:val="21"/>
           <w:szCs w:val="21"/>
         </w:rPr>
-        <w:t xml:space="preserve">James is the opening case, not the subject. And the author never recommends printing the first texts; paragraph 3 attacks a principle, not the later James.</w:t>
+        <w:t xml:space="preserve">James is the opening case, not the subject. This leaves out the social theory, digital editions and the closing point about unfinished works.</w:t>
       </w:r>
     </w:p>
     <w:p>
@@ -19948,7 +19948,7 @@
           <w:sz w:val="22"/>
           <w:szCs w:val="22"/>
         </w:rPr>
-        <w:t xml:space="preserve">Critics' readings of particular passages in James have repeatedly changed once a puzzling word was traced to a compositor rather than to James.</w:t>
+        <w:t xml:space="preserve">Critics' readings of particular passages in James have repeatedly changed once a puzzling word was traced to a compositor, not to James.</w:t>
       </w:r>
     </w:p>
     <w:p>
@@ -20219,7 +20219,7 @@
           <w:sz w:val="22"/>
           <w:szCs w:val="22"/>
         </w:rPr>
-        <w:t xml:space="preserve">a rule for choosing between texts ought not to rest on a judgment of literary merit that it never openly states.</w:t>
+        <w:t xml:space="preserve">a rule for choosing between texts ought not to rest on a judgment of literary merit that it never states.</w:t>
       </w:r>
     </w:p>
     <w:p>
@@ -20279,7 +20279,7 @@
           <w:sz w:val="22"/>
           <w:szCs w:val="22"/>
         </w:rPr>
-        <w:t xml:space="preserve">a writer's last word on a book is generally weaker than his first, since his late revisions reflect a changed sensibility.</w:t>
+        <w:t xml:space="preserve">W. W. Greg would not himself have accepted the principle into which his successors later hardened his own method.</w:t>
       </w:r>
     </w:p>
     <w:p>
@@ -20309,7 +20309,7 @@
           <w:sz w:val="22"/>
           <w:szCs w:val="22"/>
         </w:rPr>
-        <w:t xml:space="preserve">Greg's distinction between substantive readings and accidentals cannot be applied to revisions as extensive as those James made.</w:t>
+        <w:t xml:space="preserve">Greg's distinction between substantive readings and accidentals cannot be applied to revisions as extensive as James's.</w:t>
       </w:r>
     </w:p>
     <w:p>
@@ -20432,7 +20432,7 @@
           <w:sz w:val="20"/>
           <w:szCs w:val="20"/>
         </w:rPr>
-        <w:t xml:space="preserve">(c) · X (Absolute word): </w:t>
+        <w:t xml:space="preserve">(c) · N (Supported, not the needed link): </w:t>
       </w:r>
       <w:r>
         <w:rPr>
@@ -20441,7 +20441,7 @@
           <w:sz w:val="21"/>
           <w:szCs w:val="21"/>
         </w:rPr>
-        <w:t xml:space="preserve">The author denies that the last word 'must be' the best. That does not require claiming it is generally worse.</w:t>
+        <w:t xml:space="preserve">Paragraph 2 says Greg's essay was 'more modest than the uses later made of it', but the charge in paragraph 3 does not depend on what Greg would have accepted.</w:t>
       </w:r>
     </w:p>
     <w:p>
@@ -20599,7 +20599,7 @@
           <w:sz w:val="22"/>
           <w:szCs w:val="22"/>
         </w:rPr>
-        <w:t xml:space="preserve">, thereby left</w:t>
+        <w:t xml:space="preserve">, in so doing it left</w:t>
       </w:r>
     </w:p>
     <w:p>
@@ -20629,7 +20629,7 @@
           <w:sz w:val="22"/>
           <w:szCs w:val="22"/>
         </w:rPr>
-        <w:t xml:space="preserve">, and thereby leaving</w:t>
+        <w:t xml:space="preserve">so as to leave</w:t>
       </w:r>
     </w:p>
     <w:p>
@@ -20689,7 +20689,7 @@
           <w:sz w:val="22"/>
           <w:szCs w:val="22"/>
         </w:rPr>
-        <w:t xml:space="preserve">so as to leave</w:t>
+        <w:t xml:space="preserve">; thereby leaving</w:t>
       </w:r>
     </w:p>
     <w:p>
@@ -20741,7 +20741,7 @@
           <w:sz w:val="21"/>
           <w:szCs w:val="21"/>
         </w:rPr>
-        <w:t xml:space="preserve">The original is a comma splice (', it left'). The fix must express a result without a second subject. ', thereby leaving' does; ', thereby left' and ', and thereby leaving' each break a rule, and 'so as to leave' changes result into purpose.</w:t>
+        <w:t xml:space="preserve">The original is a comma splice (', it left'). The fix must express a result without a second subject. ', thereby leaving' does; the semicolon version has no clause after the semicolon, ', in so doing it left' is still a comma splice, and 'so as to leave' changes result into purpose.</w:t>
       </w:r>
     </w:p>
     <w:p>
@@ -20790,7 +20790,7 @@
           <w:sz w:val="21"/>
           <w:szCs w:val="21"/>
         </w:rPr>
-        <w:t xml:space="preserve">'Thereby' is an adverb, not a conjunction, so it cannot join a second finite verb ('left') to the clause. It needs 'and thereby left' or 'thereby leaving'.</w:t>
+        <w:t xml:space="preserve">This still joins two independent clauses ('James rewrote…' and 'it left…') with only a comma. 'In so doing' does not cure the comma splice.</w:t>
       </w:r>
     </w:p>
     <w:p>
@@ -20821,7 +20821,7 @@
           <w:sz w:val="21"/>
           <w:szCs w:val="21"/>
         </w:rPr>
-        <w:t xml:space="preserve">'And' must join like with like: 'rewrote… and thereby left'. 'And thereby leaving' pairs a finite verb with a participle.</w:t>
+        <w:t xml:space="preserve">This is grammatical but turns the result into James's purpose, which changes the meaning.</w:t>
       </w:r>
     </w:p>
     <w:p>
@@ -20852,7 +20852,7 @@
           <w:sz w:val="21"/>
           <w:szCs w:val="21"/>
         </w:rPr>
-        <w:t xml:space="preserve">This is grammatical but turns the result into James's purpose, which changes the meaning.</w:t>
+        <w:t xml:space="preserve">A semicolon must be followed by a full clause. 'Thereby leaving readers…' has no subject or finite verb.</w:t>
       </w:r>
     </w:p>
     <w:p>
@@ -20883,7 +20883,7 @@
           <w:sz w:val="19"/>
           <w:szCs w:val="19"/>
         </w:rPr>
-        <w:t xml:space="preserve">Countdown 10 Q69 and Q74 (grammar: comma splice, faulty 'and', infinitive of purpose)</w:t>
+        <w:t xml:space="preserve">Countdown 10 Q69 and Q74 (grammar: comma splice, 'thereby + -ing', infinitive of purpose)</w:t>
       </w:r>
     </w:p>
     <w:p>
@@ -20960,7 +20960,7 @@
           <w:sz w:val="22"/>
           <w:szCs w:val="22"/>
         </w:rPr>
-        <w:t xml:space="preserve">Detached and analytical, because it lays out the competing editorial doctrines in turn without passing judgment on any of them.</w:t>
+        <w:t xml:space="preserve">Detached and analytical, because it sets out the rival editorial doctrines in turn, explaining how each arose and what it claims.</w:t>
       </w:r>
     </w:p>
     <w:p>
@@ -20990,7 +20990,7 @@
           <w:sz w:val="22"/>
           <w:szCs w:val="22"/>
         </w:rPr>
-        <w:t xml:space="preserve">Sceptical but hopeful, because it doubts the older doctrines while expecting digital editions to settle the quarrel they began.</w:t>
+        <w:t xml:space="preserve">Sceptical and wistful, because it ends by suggesting that for some works no single text, and no display of all of them, can be the work.</w:t>
       </w:r>
     </w:p>
     <w:p>
@@ -21020,7 +21020,7 @@
           <w:sz w:val="22"/>
           <w:szCs w:val="22"/>
         </w:rPr>
-        <w:t xml:space="preserve">Dismissive and impatient, because it treats the editors' debate as a scholastic quarrel of little interest to ordinary readers.</w:t>
+        <w:t xml:space="preserve">Impatient and dismissive, because it finds fault in turn with the final-intention principle, the social theory and the digital promise.</w:t>
       </w:r>
     </w:p>
     <w:p>
@@ -21102,7 +21102,7 @@
           <w:sz w:val="21"/>
           <w:szCs w:val="21"/>
         </w:rPr>
-        <w:t xml:space="preserve">The author is demanding about every position yet gives each its due, Greg included: exacting, but fair-minded.</w:t>
+        <w:t xml:space="preserve">Every reason clause is true; the labels decide. The author is demanding about every position yet gives each its due, Greg included: exacting, but fair-minded.</w:t>
       </w:r>
     </w:p>
     <w:p>
@@ -21151,7 +21151,7 @@
           <w:sz w:val="21"/>
           <w:szCs w:val="21"/>
         </w:rPr>
-        <w:t xml:space="preserve">Analytical, yes, but the author judges every position: 'smuggled', 'pays for the correction', 'what it hides'.</w:t>
+        <w:t xml:space="preserve">The clause is true, but the label is not: the author judges each doctrine ('smuggled', 'pays for the correction', 'what it hides').</w:t>
       </w:r>
     </w:p>
     <w:p>
@@ -21182,7 +21182,7 @@
           <w:sz w:val="21"/>
           <w:szCs w:val="21"/>
         </w:rPr>
-        <w:t xml:space="preserve">'Sceptical' fits. 'Hopeful' does not: the author says the digital 'promise' hides a problem, and some works resist any choice.</w:t>
+        <w:t xml:space="preserve">The clause is true and 'sceptical' fits, but nothing in the passage longs for a lost certainty, so 'wistful' is unsupported.</w:t>
       </w:r>
     </w:p>
     <w:p>
@@ -21204,7 +21204,7 @@
           <w:sz w:val="20"/>
           <w:szCs w:val="20"/>
         </w:rPr>
-        <w:t xml:space="preserve">(c) · L (Mixes up two things): </w:t>
+        <w:t xml:space="preserve">(c) · O (Half-right tone): </w:t>
       </w:r>
       <w:r>
         <w:rPr>
@@ -21213,7 +21213,7 @@
           <w:sz w:val="21"/>
           <w:szCs w:val="21"/>
         </w:rPr>
-        <w:t xml:space="preserve">Both words are wrong. The author says readers have 'every reason' to care and that 'whether James wrote a given word' is 'often the question a reader most wants answered'.</w:t>
+        <w:t xml:space="preserve">The author does find fault with each, but grants each its due ('more modest', 'corrects a real naivety', 'genuine'). Nothing is impatient or dismissive.</w:t>
       </w:r>
     </w:p>
     <w:p>
@@ -21244,7 +21244,7 @@
           <w:sz w:val="19"/>
           <w:szCs w:val="19"/>
         </w:rPr>
-        <w:t xml:space="preserve">Countdown 5 Q75 ('detached and analytical' picked for a critical passage) and Sectional 1 (an echo word paired with an unsupported second word)</w:t>
+        <w:t xml:space="preserve">Countdown 5 Q75 ('detached and analytical' picked for a critical passage) and Sectional 1 (a right word paired with an unsupported second word)</w:t>
       </w:r>
     </w:p>
     <w:p>
@@ -21321,7 +21321,7 @@
           <w:sz w:val="22"/>
           <w:szCs w:val="22"/>
         </w:rPr>
-        <w:t xml:space="preserve">Works that their authors revised more than once were probably, for those authors, never truly finished, however settled their printed texts appeared.</w:t>
+        <w:t xml:space="preserve">Works that their authors revised more than once were probably, for those authors, never truly finished, however settled their printed text.</w:t>
       </w:r>
     </w:p>
     <w:p>
@@ -21351,7 +21351,7 @@
           <w:sz w:val="22"/>
           <w:szCs w:val="22"/>
         </w:rPr>
-        <w:t xml:space="preserve">A reader given every version of a revised novel, with nothing to guide the choice, is in effect being asked to do an editor's work without an editor's knowledge.</w:t>
+        <w:t xml:space="preserve">A digital edition that told its readers which version to read first would, to that extent, be keeping the editor's judgment in place rather than abolishing it.</w:t>
       </w:r>
     </w:p>
     <w:p>
@@ -21448,7 +21448,7 @@
           <w:sz w:val="22"/>
           <w:szCs w:val="22"/>
         </w:rPr>
-        <w:t xml:space="preserve">'A reader offered every text with no guidance… has not been freed from the editor's judgment so much as handed it, usually without the knowledge needed to exercise it.' Being handed the judgment without the knowledge is doing an editor's work without an editor's knowledge.</w:t>
+        <w:t xml:space="preserve">The paragraph says a reader given every text 'with no guidance on which to read first' has not been freed from the editor's judgment 'so much as handed it'. Guidance on which text comes first is that judgment, so an edition that gives it has kept the editor's role rather than ended it.</w:t>
       </w:r>
     </w:p>
     <w:p>
@@ -21463,7 +21463,7 @@
           <w:sz w:val="21"/>
           <w:szCs w:val="21"/>
         </w:rPr>
-        <w:t xml:space="preserve">The paragraph's inference is that displaying everything does not remove the need to judge; it moves the editor's judgment to a reader who usually lacks the editor's knowledge.</w:t>
+        <w:t xml:space="preserve">The inference runs from 'no guidance on which to read first… handed it': deciding which text comes first is the editor's judgment, whoever exercises it. An edition that guides the reader has not abolished that judgment.</w:t>
       </w:r>
     </w:p>
     <w:p>
@@ -21543,7 +21543,7 @@
           <w:sz w:val="21"/>
           <w:szCs w:val="21"/>
         </w:rPr>
-        <w:t xml:space="preserve">This adds a comparison with printed editions that the paragraph never makes. The digital edition hides the fact that the judgment has been passed to the reader, not any editor's choices.</w:t>
+        <w:t xml:space="preserve">This adds a comparison with printed editions that the paragraph never makes. What the digital promise hides is that the judgment passes to the reader, not any choice of the editor's.</w:t>
       </w:r>
     </w:p>
     <w:p>
@@ -21605,7 +21605,7 @@
           <w:sz w:val="19"/>
           <w:szCs w:val="19"/>
         </w:rPr>
-        <w:t xml:space="preserve">AILET 2 Q38 (unearned 'every') and the author's-response miss (an added comparison)</w:t>
+        <w:t xml:space="preserve">AILET 2 Q38 (an unearned generalisation, here hedged) and the author's-response miss (an added comparison)</w:t>
       </w:r>
     </w:p>
     <w:sectPr>

</xml_diff>

<commit_message>
RC 800 Sectional 4: remove last surface cues found in the final blind check
Untwins Q6, Q16 and Q22, drops the lone 'but' from the tone key,
replaces a weak Q18 distractor, and tightens Q2 and Q9 wording.

Co-Authored-By: Claude Opus 5.5 <noreply@anthropic.com>
Claude-Session: https://claude.ai/code/session_01JEFnJwWLYkcsS1QcD4NEhs
</commit_message>
<xml_diff>
--- a/rc-800-sectional-4/RC_800_Sectional_4_Answer_Key.docx
+++ b/rc-800-sectional-4/RC_800_Sectional_4_Answer_Key.docx
@@ -13241,7 +13241,7 @@
           <w:sz w:val="22"/>
           <w:szCs w:val="22"/>
         </w:rPr>
-        <w:t xml:space="preserve">Notes people make when abandoning a promise to themselves seldom mention its purpose, yet asked later, most say they dropped it because its purpose was spent.</w:t>
+        <w:t xml:space="preserve">Diaries kept as people abandon self-promises show them weighing only their current wishes, yet at that moment most say they are weighing the promise's purpose.</w:t>
       </w:r>
     </w:p>
     <w:p>
@@ -13368,7 +13368,7 @@
           <w:sz w:val="22"/>
           <w:szCs w:val="22"/>
         </w:rPr>
-        <w:t xml:space="preserve">The claim is that a person can tell whether she is asking 'does the purpose still hold?' or 'do I still feel like it?'. If her notes at the time never raise the purpose, yet afterwards she sincerely reports that the purpose was spent, she has mistaken which question she was asking.</w:t>
+        <w:t xml:space="preserve">The claim is that a person can tell whether she is asking 'does the purpose still hold?' or 'do I still feel like it?'. If, at the very moment of deciding, people are asking the second while sincerely saying they are asking the first, they cannot tell which question they are asking.</w:t>
       </w:r>
     </w:p>
     <w:p>
@@ -14715,7 +14715,7 @@
           <w:sz w:val="22"/>
           <w:szCs w:val="22"/>
         </w:rPr>
-        <w:t xml:space="preserve">Those who seldom put off unpleasant tasks keep a far larger share of their promises to themselves than habitual procrastinators manage to keep.</w:t>
+        <w:t xml:space="preserve">Procrastinators reminded of a promise's purpose at the moment of temptation break it about as often as those who are not reminded at all.</w:t>
       </w:r>
     </w:p>
     <w:p>
@@ -14876,7 +14876,7 @@
           <w:sz w:val="21"/>
           <w:szCs w:val="21"/>
         </w:rPr>
-        <w:t xml:space="preserve">This supports the claim: self-promises bind best those who need binding least.</w:t>
+        <w:t xml:space="preserve">This supports paragraph 4: for the procrastinator the distinction 'describes what he lacks rather than supplying what he needs', so pointing him to the promisee's standpoint does not help.</w:t>
       </w:r>
     </w:p>
     <w:p>
@@ -15789,7 +15789,7 @@
           <w:sz w:val="22"/>
           <w:szCs w:val="22"/>
         </w:rPr>
-        <w:t xml:space="preserve">Had the survivors' protection been genetic, their descendants would have inherited it and resisted the drug better.</w:t>
+        <w:t xml:space="preserve">Had the survivors been resistant, their descendants would have inherited that resistance and survived the drug better.</w:t>
       </w:r>
     </w:p>
     <w:p>
@@ -15931,7 +15931,7 @@
           <w:sz w:val="21"/>
           <w:szCs w:val="21"/>
         </w:rPr>
-        <w:t xml:space="preserve">Negate (a): if a genetic protection need not show up in the descendants, then descendants dying 'as the original had' no longer rules out resistance. So the conclusion depends on (a), and needs nothing about how the culture was prepared.</w:t>
+        <w:t xml:space="preserve">Negate (a): if resistance need not show up in the descendants, then descendants dying 'as the original had' no longer rules out resistance. So the conclusion depends on (a), and needs nothing about how the culture was prepared.</w:t>
       </w:r>
     </w:p>
     <w:p>
@@ -18393,7 +18393,7 @@
           <w:sz w:val="22"/>
           <w:szCs w:val="22"/>
         </w:rPr>
-        <w:t xml:space="preserve">Metaphor, because the verdict and the indictment are spoken of as trains, an image the author carries on through 'timetable' and 'station'.</w:t>
+        <w:t xml:space="preserve">Metaphor, because the verdict and the indictment are pictured as trains, an image the author carries on through 'timetable' and 'station'.</w:t>
       </w:r>
     </w:p>
     <w:p>
@@ -18423,7 +18423,7 @@
           <w:sz w:val="22"/>
           <w:szCs w:val="22"/>
         </w:rPr>
-        <w:t xml:space="preserve">Personification, because two bodies of scholarship are made to travel, keep time and fail to arrive, as though they had purposes of their own.</w:t>
+        <w:t xml:space="preserve">Personification, because two bodies of scholarship are made to keep their own 'timetable' and miss each other's 'station', as if they had purposes.</w:t>
       </w:r>
     </w:p>
     <w:p>
@@ -19205,7 +19205,7 @@
           <w:sz w:val="22"/>
           <w:szCs w:val="22"/>
         </w:rPr>
-        <w:t xml:space="preserve">a headlong attack, because the critics went after the railways more persistently than after anything else.</w:t>
+        <w:t xml:space="preserve">a responsibility entrusted, because the lines were placed in the charge of the British companies that built them.</w:t>
       </w:r>
     </w:p>
     <w:p>
@@ -19368,7 +19368,7 @@
           <w:sz w:val="21"/>
           <w:szCs w:val="21"/>
         </w:rPr>
-        <w:t xml:space="preserve">The clause echoes 'pressed more persistently', but a charge in the sense of an attack is not 'levied on' anyone.</w:t>
+        <w:t xml:space="preserve">The clause is true to the passage (the lines were 'built by British companies'), but that is the sense of 'in the charge of'. A responsibility is not 'levied on' anyone.</w:t>
       </w:r>
     </w:p>
     <w:p>
@@ -20599,7 +20599,7 @@
           <w:sz w:val="22"/>
           <w:szCs w:val="22"/>
         </w:rPr>
-        <w:t xml:space="preserve">, in so doing it left</w:t>
+        <w:t xml:space="preserve">, thereby it left</w:t>
       </w:r>
     </w:p>
     <w:p>
@@ -20741,7 +20741,7 @@
           <w:sz w:val="21"/>
           <w:szCs w:val="21"/>
         </w:rPr>
-        <w:t xml:space="preserve">The original is a comma splice (', it left'). The fix must express a result without a second subject. ', thereby leaving' does; the semicolon version has no clause after the semicolon, ', in so doing it left' is still a comma splice, and 'so as to leave' changes result into purpose.</w:t>
+        <w:t xml:space="preserve">The original is a comma splice (', it left'). The fix must express a result without a second subject. ', thereby leaving' does; the semicolon version has no clause after the semicolon, ', thereby it left' is still a comma splice, and 'so as to leave' changes result into purpose.</w:t>
       </w:r>
     </w:p>
     <w:p>
@@ -20790,7 +20790,7 @@
           <w:sz w:val="21"/>
           <w:szCs w:val="21"/>
         </w:rPr>
-        <w:t xml:space="preserve">This still joins two independent clauses ('James rewrote…' and 'it left…') with only a comma. 'In so doing' does not cure the comma splice.</w:t>
+        <w:t xml:space="preserve">This still joins two independent clauses ('James rewrote…' and 'it left…') with only a comma. 'Thereby' is an adverb, not a conjunction, so it does not cure the comma splice.</w:t>
       </w:r>
     </w:p>
     <w:p>
@@ -21050,7 +21050,7 @@
           <w:sz w:val="22"/>
           <w:szCs w:val="22"/>
         </w:rPr>
-        <w:t xml:space="preserve">Exacting but fair-minded, because it separates Greg from his successors and grants the social theory and digital editions their real merits.</w:t>
+        <w:t xml:space="preserve">Exacting and even-handed, because it separates Greg from his successors and grants the social theory and digital editions their real merits.</w:t>
       </w:r>
     </w:p>
     <w:p>
@@ -21102,7 +21102,7 @@
           <w:sz w:val="21"/>
           <w:szCs w:val="21"/>
         </w:rPr>
-        <w:t xml:space="preserve">Every reason clause is true; the labels decide. The author is demanding about every position yet gives each its due, Greg included: exacting, but fair-minded.</w:t>
+        <w:t xml:space="preserve">Every reason clause is true; the labels decide. The author is demanding about every position yet gives each its due, Greg included: exacting and even-handed.</w:t>
       </w:r>
     </w:p>
     <w:p>

</xml_diff>